<commit_message>
final: record team commits and align reviewed group answer
</commit_message>
<xml_diff>
--- a/final-exam/final-exam-group-answer.docx
+++ b/final-exam/final-exam-group-answer.docx
@@ -15462,7 +15462,7 @@
                 <w:sz w:val="28"/>
                 <w:szCs w:val="28"/>
               </w:rPr>
-              <w:t xml:space="preserve">ตรวจ role/ownership/BR-01–04; ผู้รับ/opt-in/PII; แจ้ง; สถานะ+audit transaction เดียว</w:t>
+              <w:t xml:space="preserve">ตรวจ role/ownership/BR-01–04; ผู้รับ/opt-in/PII; แจ้ง; ทุกสถานะคิว/เครื่องที่เปลี่ยนสำเร็จบันทึกพร้อม audit transaction เดียว ตาม FR-FX-04/DR-FX-02 ใน G2.4</w:t>
             </w:r>
           </w:p>
         </w:tc>
@@ -17216,7 +17216,7 @@
                 <w:sz w:val="28"/>
                 <w:szCs w:val="28"/>
               </w:rPr>
-              <w:t xml:space="preserve">เพิ่ม C4 ชนิด scheduled job จาก C1–C3 ใช้ Node.js เรียก C2 ตรวจเงื่อนไข C2 ใช้ C3 PostgreSQL ผ่าน SQL/transaction บันทึกสถานะกับ audit ตาม FR-FX-04/DR-FX-02 ใน transaction เดียว audit ล้มเหลวต้อง rollback และไม่ยืนยัน/แจ้งว่าสถานะใหม่สำเร็จตาม AC-FX-08 หลัง commit จึงสร้างรายการแจ้งของสถานะใหม่ตาม FR-FX-03 ไม่เพิ่ม audit/notification service หรือ broker</w:t>
+              <w:t xml:space="preserve">เพิ่ม C4 Scheduled Job [Node.js] เรียก C2 ตรวจงานถึงเวลา; C2/C3 บันทึกทุกสถานะคิวหรือเครื่องที่เปลี่ยนสำเร็จพร้อม audit ใน transaction เดียว ตาม FR-FX-04/DR-FX-02 (field ใน G2.4); audit ล้มเหลว rollback และไม่แจ้งสำเร็จ</w:t>
             </w:r>
           </w:p>
         </w:tc>
@@ -17290,7 +17290,7 @@
                 <w:sz w:val="28"/>
                 <w:szCs w:val="28"/>
               </w:rPr>
-              <w:t xml:space="preserve">CR-FX-01(2), FR-03/04 และ D-FX-03 ต้องทำงานได้โดยไม่มีคนเปิดเว็บ; audit ต้องคงไว้ในรุ่นแรกตามข้อเสนอ 02B และ G2 ฉบับแก้ไขที่ตรวจเทียบแล้ว การเขียน audit หลังสถานะ commit แยกกันทำให้เหลือสถานะใหม่โดยไม่มีหลักฐานเมื่อเกิดข้อผิดพลาด</w:t>
+              <w:t xml:space="preserve">CR-FX-01(2), FR-03/04 และ D-FX-03 ต้องทำงานแม้เว็บปิด; AC-FX-08 ต้องไม่เหลือสถานะใหม่เมื่อ audit ล้มเหลว</w:t>
             </w:r>
           </w:p>
         </w:tc>
@@ -17364,7 +17364,7 @@
                 <w:sz w:val="28"/>
                 <w:szCs w:val="28"/>
               </w:rPr>
-              <w:t xml:space="preserve">browser timer หรือรอ request ผู้ใช้ (ไม่มีตัวกระตุ้นเมื่อเว็บปิด); บันทึกสถานะก่อนแล้ว audit ภายหลัง (ผิด AC-FX-08); เพิ่ม service/ฐานข้อมูล audit แยก (ไม่มี requirement บังคับและเพิ่มภาระ)</w:t>
+              <w:t xml:space="preserve">ไม่ใช้ timer browser/รอ request ผู้ใช้; ไม่เขียน audit แยกหลัง commit; ไม่เพิ่ม broker หรือ audit service เพราะไม่มี requirement บังคับ</w:t>
             </w:r>
           </w:p>
         </w:tc>
@@ -17438,7 +17438,7 @@
                 <w:sz w:val="28"/>
                 <w:szCs w:val="28"/>
               </w:rPr>
-              <w:t xml:space="preserve">เพิ่ม runtime งานตามเวลาหนึ่งชนิด; C2 ยังคุมกติกาและ C3 commit/rollback ร่วมกัน; ผู้ใช้ได้รับผลล้มเหลวเมื่อบันทึก audit ไม่สำเร็จ; scheduler, restart, กันส่งซ้ำและการสร้างรายการแจ้งหลัง commit รอ DD-FX-04 ไม่อ้างว่าตัด scope แล้วทำทันแน่นอน</w:t>
+              <w:t xml:space="preserve">เพิ่ม runtime งานตามเวลา กฎยังอยู่ C2; scheduler/restart/กันซ้ำและงานแจ้งหลัง commit รอ DD-FX-04; ใช้ PostgreSQL/SQL transaction ตามข้อเสนอ</w:t>
             </w:r>
           </w:p>
         </w:tc>
@@ -17580,7 +17580,7 @@
                 <w:sz w:val="28"/>
                 <w:szCs w:val="28"/>
               </w:rPr>
-              <w:t xml:space="preserve">คงรายการแจ้งในเว็บ FR-FX-03 และการอ่าน audit แบบง่าย FR-FX-04/BR-FX-02 เป็น Build now ใน C1/C2/C3 ใช้ชุด container เดิม รายการแจ้งสร้างเมื่อเว็บปิดและเจ้าของอ่านย้อนหลังได้แม้ไม่ opt-in ภายนอก ผู้ดูแลอ่าน audit ได้เมื่อ C2 ตรวจสิทธิ์ผ่านตาม UC-FX-03/AC-FX-09 ปฏิเสธนักศึกษาอ่านและแก้/ลบผ่านงานทั่วไป ส่วนรายงาน/ค้นหาขั้นสูง Later; ภายนอก Overview/TBD ส่งจริง Later</w:t>
+              <w:t xml:space="preserve">Build now: FR-FX-03 เก็บแจ้งในเว็บแม้เว็บปิด/ไม่ opt-in ภายนอก; ผู้ดูแลที่มีสิทธิ์อ่าน audit แบบง่ายผ่าน C2/C3 ตาม BR-FX-02 ส่วนภายนอก Overview/ส่งจริง Later และรายงานขั้นสูง Later</w:t>
             </w:r>
           </w:p>
         </w:tc>
@@ -17654,7 +17654,7 @@
                 <w:sz w:val="28"/>
                 <w:szCs w:val="28"/>
               </w:rPr>
-              <w:t xml:space="preserve">FR-FX-03/AC-FX-06 แยกรายการในเว็บจาก opt-in ภายนอก; BR-FX-02/AC-FX-09 กำหนดสิทธิ์ audit; CR-FX-01(3), NFR-01 และ BR-04 ต้องลดข้อมูลและตรวจผู้รับ เวลารุ่นแรกที่ลดลงตาม 02B ควรลดงานรองโดยไม่ตัดกติกาสำคัญ</w:t>
+              <w:t xml:space="preserve">AC-FX-06 แยกเว็บจาก opt-in ภายนอก; UC-FX-03/AC-FX-09 คุมการอ่าน/แก้ลบ audit; NFR-FX-01/BR-04 ลดข้อมูล; 02B ให้ลดงานรอง</w:t>
             </w:r>
           </w:p>
         </w:tc>
@@ -17728,7 +17728,7 @@
                 <w:sz w:val="28"/>
                 <w:szCs w:val="28"/>
               </w:rPr>
-              <w:t xml:space="preserve">ผูกการแจ้งในเว็บกับ opt-in ภายนอก; ใช้ browser push แทนรายการย้อนหลัง; ตัดหน้าอ่าน audit ขั้นต่ำไปพร้อมรายงานขั้นสูง; ตรวจสิทธิ์แค่ใน C1; เดาผู้ให้บริการภายนอก</w:t>
+              <w:t xml:space="preserve">ไม่ผูกเว็บกับ opt-in ภายนอก ไม่ใช้ browser push แทนประวัติ ไม่ตัดหน้าอ่าน audit แบบง่าย และไม่ตรวจสิทธิ์เฉพาะ C1</w:t>
             </w:r>
           </w:p>
         </w:tc>
@@ -17802,7 +17802,7 @@
                 <w:sz w:val="28"/>
                 <w:szCs w:val="28"/>
               </w:rPr>
-              <w:t xml:space="preserve">หน้าเว็บมีรายการส่วนตัวและหน้าอ่าน audit แบบง่าย แต่ API เป็นผู้ตัดสินสิทธิ์; ภายนอกยังส่งจริงไม่ได้จนตกลง interface; scope และ CR ยังรอผู้มีอำนาจตัดสิน ไม่อ้างอนุมัติแล้ว</w:t>
+              <w:t xml:space="preserve">ใช้ C1/C2/C3 เดิม ปฏิเสธนักศึกษาอ่าน audit และแก้/ลบผ่านงานทั่วไป; ช่องทางภายนอก/interface ยัง TBD และ scope ต้องให้ผู้มีอำนาจตัดสิน</w:t>
             </w:r>
           </w:p>
         </w:tc>
@@ -22296,7 +22296,9 @@
                 <w:sz w:val="28"/>
                 <w:szCs w:val="28"/>
               </w:rPr>
-              <w:t xml:space="preserve">g1-g2-wijitsilp.md; G1/G2 ในไฟล์นี้; commit ของเจ้าของงานรอกรอก</w:t>
+              <w:t xml:space="preserve">commit 734986d</w:t>
+              <w:br/>
+              <w:t xml:space="preserve">g1-g2-wijitsilp.md; G1/G2 ในไฟล์นี้</w:t>
             </w:r>
           </w:p>
         </w:tc>
@@ -22405,9 +22407,9 @@
                 <w:sz w:val="28"/>
                 <w:szCs w:val="28"/>
               </w:rPr>
-              <w:t xml:space="preserve">G3/G5: 410676027237260b4552ab2ce7feb30f3f3c6ec2</w:t>
+              <w:t xml:space="preserve">G3/G5: commit 4106760</w:t>
               <w:br/>
-              <w:t xml:space="preserve">pasit-g3-g5-draft.md; Word/ไฟล์รวมดู commit ถัดไปใน branch final-exam</w:t>
+              <w:t xml:space="preserve">รวม Word/ไฟล์ส่ง: commit 20bd38f และรอบปรับหลักฐานล่าสุดใน PR</w:t>
             </w:r>
           </w:p>
         </w:tc>
@@ -22516,7 +22518,9 @@
                 <w:sz w:val="28"/>
                 <w:szCs w:val="28"/>
               </w:rPr>
-              <w:t xml:space="preserve">g4-architecture-pathomporn.md; diagrams/context-after.* และ container-after.*; commit รอกรอก</w:t>
+              <w:t xml:space="preserve">commit 85c2165</w:t>
+              <w:br/>
+              <w:t xml:space="preserve">g4-architecture-pathomporn.md และ diagrams/context-after.*, container-after.*</w:t>
             </w:r>
           </w:p>
         </w:tc>

</xml_diff>

<commit_message>
docs(final): record confirmed team reading and oral readiness
</commit_message>
<xml_diff>
--- a/final-exam/final-exam-group-answer.docx
+++ b/final-exam/final-exam-group-answer.docx
@@ -22028,7 +22028,7 @@
                 <w:sz w:val="28"/>
                 <w:szCs w:val="28"/>
               </w:rPr>
-              <w:t xml:space="preserve">ตรวจเอกสารและภาพที่แสดงผล; การรับรองว่าทุกคนอ่านฉบับรวมยังรอสมาชิกยืนยัน ดู ai-use-log.md ประกอบ</w:t>
+              <w:t xml:space="preserve">ตรวจเอกสารและภาพที่แสดงผล; พสิษฐิ์ยืนยันว่าสมาชิกทั้ง 3 คนตรวจทานฉบับรวมและพร้อม oral แล้ว ดู ai-use-log.md ประกอบ</w:t>
             </w:r>
           </w:p>
         </w:tc>
@@ -22554,7 +22554,7 @@
           <w:sz w:val="32"/>
           <w:szCs w:val="32"/>
         </w:rPr>
-        <w:t xml:space="preserve">รับรองการอ่านคำตอบทั้งฉบับและพร้อมอธิบาย oral spot-check: รอสมาชิกทุกคนยืนยันหลังอ่าน Word ฉบับรวม (ยังไม่ติ๊กแทนสมาชิก)</w:t>
+        <w:t xml:space="preserve">☑ รับรองการอ่านคำตอบทั้งฉบับและพร้อมอธิบาย oral spot-check: สมาชิกทั้ง 3 คนตรวจทานแล้ว ตามคำยืนยันของพสิษฐิ์วันที่ 23 ตุลาคม 2569</w:t>
       </w:r>
     </w:p>
     <w:sectPr>

</xml_diff>

<commit_message>
docs(final): record confirmed Draw.io source review
</commit_message>
<xml_diff>
--- a/final-exam/final-exam-group-answer.docx
+++ b/final-exam/final-exam-group-answer.docx
@@ -21444,7 +21444,7 @@
           <w:sz w:val="32"/>
           <w:szCs w:val="32"/>
         </w:rPr>
-        <w:t xml:space="preserve">☑ มี Context/Container ทั้ง .drawio และ PNG; XML ตรวจอ่านได้ แต่การเปิด source ในแอป draw.io โดยผู้จัดทำยังรอยืนยัน</w:t>
+        <w:t xml:space="preserve">☑ มี Context/Container ทั้ง .drawio และ PNG; เปิด source ทั้งสองไฟล์ตรวจในแอปและเทียบกับภาพแล้ว ตามคำยืนยันของพสิษฐิ์วันที่ 23 ตุลาคม 2569</w:t>
       </w:r>
     </w:p>
     <w:p>
@@ -21921,7 +21921,7 @@
                 <w:sz w:val="28"/>
                 <w:szCs w:val="28"/>
               </w:rPr>
-              <w:t xml:space="preserve">ตรวจ PNG/XML; log ล่าสุดยังรอยืนยันมนุษย์เปิด source และเทียบ ID; ไม่อ้างทดสอบระบบจริง</w:t>
+              <w:t xml:space="preserve">ตรวจ PNG/XML; พสิษฐิ์ยืนยันว่าตรวจ source ทั้งสองไฟล์ในแอปแล้ว; ไม่อ้างทดสอบระบบจริง</w:t>
             </w:r>
           </w:p>
         </w:tc>

</xml_diff>